<commit_message>
vault backup: 2026-04-07 12:03:29
</commit_message>
<xml_diff>
--- a/计算机技术学习/漏洞报告/xjgc/新疆工程学院某系统存在会话认证缺陷漏洞_1.docx
+++ b/计算机技术学习/漏洞报告/xjgc/新疆工程学院某系统存在会话认证缺陷漏洞_1.docx
@@ -132,7 +132,15 @@
         <w:rPr>
           <w:rFonts w:hint="eastAsia"/>
         </w:rPr>
-        <w:t>新疆工程学院 [XX 核心学生管理系统] 对用户会话标识（JSESSIONID）缺乏有效校验，未将 JSESSIONID 与客户端 IP、User-Agent 等信息进行绑定，也未对会话做严格的有效性验证。攻击者可通过 Burp Suite 等工具抓取合法用户的 JSESSIONID，替换自身请求中的 Cookie 字段，在无需密码、无需验证码、无任何前置权限的情况下，直接以其他用户（学生 / 教职工）身份访问系统，实现水平越权，可随意查看、修改他人的核心敏感信息与业务数据，漏洞利用门槛极低，危害范围覆盖全校。</w:t>
+        <w:t xml:space="preserve">新疆工程学院 </w:t>
+      </w:r>
+      <w:bookmarkStart w:id="0" w:name="_GoBack"/>
+      <w:bookmarkEnd w:id="0"/>
+      <w:r>
+        <w:rPr>
+          <w:rFonts w:hint="eastAsia"/>
+        </w:rPr>
+        <w:t>对用户会话标识（JSESSIONID）缺乏有效校验，未将 JSESSIONID 与客户端 IP、User-Agent 等信息进行绑定，也未对会话做严格的有效性验证。攻击者可通过 Burp Suite 等工具抓取合法用户的 JSESSIONID，替换自身请求中的 Cookie 字段，在无需密码、无需验证码、无任何前置权限的情况下，直接以其他用户（学生 / 教职工）身份访问系统，实现水平越权，可随意查看、修改他人的核心敏感信息与业务数据，漏洞利用门槛极低，危害范围覆盖全校。</w:t>
       </w:r>
     </w:p>
     <w:p>
@@ -269,7 +277,6 @@
           <w:color w:val="000000"/>
           <w:sz w:val="16"/>
           <w:szCs w:val="16"/>
-          <w:bdr w:val="none" w:color="auto" w:sz="0" w:space="0"/>
         </w:rPr>
         <w:t>（附：账号 A 登录后 Cookie 抓取截图）</w:t>
       </w:r>
@@ -280,6 +287,7 @@
         <w:keepLines w:val="0"/>
         <w:widowControl/>
         <w:numPr>
+          <w:ilvl w:val="0"/>
           <w:numId w:val="0"/>
         </w:numPr>
         <w:suppressLineNumbers w:val="0"/>
@@ -651,8 +659,6 @@
         </w:rPr>
         <w:t xml:space="preserve">如图，可直接修改账号A（刘）的个人账号资料。 </w:t>
       </w:r>
-      <w:bookmarkStart w:id="0" w:name="_GoBack"/>
-      <w:bookmarkEnd w:id="0"/>
     </w:p>
     <w:p>
       <w:pPr>
@@ -785,15 +791,7 @@
           <w:sz w:val="21"/>
           <w:szCs w:val="21"/>
         </w:rPr>
-        <w:t>·</w:t>
-      </w:r>
-      <w:r>
-        <w:rPr>
-          <w:rFonts w:hint="eastAsia" w:ascii="宋体" w:hAnsi="宋体" w:eastAsia="宋体" w:cs="宋体"/>
-          <w:sz w:val="21"/>
-          <w:szCs w:val="21"/>
-        </w:rPr>
-        <w:t xml:space="preserve">  </w:t>
+        <w:t xml:space="preserve">·  </w:t>
       </w:r>
       <w:r>
         <w:rPr>
@@ -804,7 +802,6 @@
           <w:color w:val="000000"/>
           <w:sz w:val="21"/>
           <w:szCs w:val="21"/>
-          <w:bdr w:val="none" w:color="auto" w:sz="0" w:space="0"/>
         </w:rPr>
         <w:t>机密性重大破坏</w:t>
       </w:r>
@@ -814,7 +811,6 @@
           <w:color w:val="000000"/>
           <w:sz w:val="21"/>
           <w:szCs w:val="21"/>
-          <w:bdr w:val="none" w:color="auto" w:sz="0" w:space="0"/>
         </w:rPr>
         <w:t>：攻击者可批量抓取合法用户 JSESSIONID，无授权获取</w:t>
       </w:r>
@@ -827,7 +823,6 @@
           <w:color w:val="000000"/>
           <w:sz w:val="21"/>
           <w:szCs w:val="21"/>
-          <w:bdr w:val="none" w:color="auto" w:sz="0" w:space="0"/>
         </w:rPr>
         <w:t>全校数千名学生的身份证号、手机号、家庭住址、学业成绩、学籍状态等核心敏感个人信息</w:t>
       </w:r>
@@ -837,7 +832,6 @@
           <w:color w:val="000000"/>
           <w:sz w:val="21"/>
           <w:szCs w:val="21"/>
-          <w:bdr w:val="none" w:color="auto" w:sz="0" w:space="0"/>
         </w:rPr>
         <w:t>，构成大规模个人信息泄露，违反《个人信息保护法》第 40 条、《网络安全法》第 21 条，涉嫌侵害学生合法权益；</w:t>
       </w:r>
@@ -869,15 +863,7 @@
           <w:sz w:val="21"/>
           <w:szCs w:val="21"/>
         </w:rPr>
-        <w:t>·</w:t>
-      </w:r>
-      <w:r>
-        <w:rPr>
-          <w:rFonts w:hint="eastAsia" w:ascii="宋体" w:hAnsi="宋体" w:eastAsia="宋体" w:cs="宋体"/>
-          <w:sz w:val="21"/>
-          <w:szCs w:val="21"/>
-        </w:rPr>
-        <w:t xml:space="preserve">  </w:t>
+        <w:t xml:space="preserve">·  </w:t>
       </w:r>
       <w:r>
         <w:rPr>
@@ -888,7 +874,6 @@
           <w:color w:val="000000"/>
           <w:sz w:val="21"/>
           <w:szCs w:val="21"/>
-          <w:bdr w:val="none" w:color="auto" w:sz="0" w:space="0"/>
         </w:rPr>
         <w:t>完整性重大破坏</w:t>
       </w:r>
@@ -898,7 +883,6 @@
           <w:color w:val="000000"/>
           <w:sz w:val="21"/>
           <w:szCs w:val="21"/>
-          <w:bdr w:val="none" w:color="auto" w:sz="0" w:space="0"/>
         </w:rPr>
         <w:t>：攻击者可越权修改他人的个人资料、选课记录、成绩备注、学籍信息等核心教务数据，直接干扰学校正常的教学管理秩序，引发教育公平问题，对学校的教学工作造成实质性破坏；</w:t>
       </w:r>
@@ -930,15 +914,7 @@
           <w:sz w:val="21"/>
           <w:szCs w:val="21"/>
         </w:rPr>
-        <w:t>·</w:t>
-      </w:r>
-      <w:r>
-        <w:rPr>
-          <w:rFonts w:hint="eastAsia" w:ascii="宋体" w:hAnsi="宋体" w:eastAsia="宋体" w:cs="宋体"/>
-          <w:sz w:val="21"/>
-          <w:szCs w:val="21"/>
-        </w:rPr>
-        <w:t xml:space="preserve">  </w:t>
+        <w:t xml:space="preserve">·  </w:t>
       </w:r>
       <w:r>
         <w:rPr>
@@ -949,7 +925,6 @@
           <w:color w:val="000000"/>
           <w:sz w:val="21"/>
           <w:szCs w:val="21"/>
-          <w:bdr w:val="none" w:color="auto" w:sz="0" w:space="0"/>
         </w:rPr>
         <w:t>利用门槛极低，危害范围极广</w:t>
       </w:r>
@@ -959,7 +934,6 @@
           <w:color w:val="000000"/>
           <w:sz w:val="21"/>
           <w:szCs w:val="21"/>
-          <w:bdr w:val="none" w:color="auto" w:sz="0" w:space="0"/>
         </w:rPr>
         <w:t>：该漏洞无需任何专业渗透技术，仅需简单的抓包、替换 Cookie 操作即可实现，任何普通攻击者均可利用，且漏洞影响覆盖全校所有学生，易引发恶性信息泄露 / 数据篡改事件，对学校的社会声誉造成严重负面影响；</w:t>
       </w:r>
@@ -991,15 +965,7 @@
           <w:sz w:val="21"/>
           <w:szCs w:val="21"/>
         </w:rPr>
-        <w:t>·</w:t>
-      </w:r>
-      <w:r>
-        <w:rPr>
-          <w:rFonts w:hint="eastAsia" w:ascii="宋体" w:hAnsi="宋体" w:eastAsia="宋体" w:cs="宋体"/>
-          <w:sz w:val="21"/>
-          <w:szCs w:val="21"/>
-        </w:rPr>
-        <w:t xml:space="preserve">  </w:t>
+        <w:t xml:space="preserve">·  </w:t>
       </w:r>
       <w:r>
         <w:rPr>
@@ -1010,7 +976,6 @@
           <w:color w:val="000000"/>
           <w:sz w:val="21"/>
           <w:szCs w:val="21"/>
-          <w:bdr w:val="none" w:color="auto" w:sz="0" w:space="0"/>
         </w:rPr>
         <w:t>可进一步横向渗透</w:t>
       </w:r>
@@ -1020,7 +985,6 @@
           <w:color w:val="000000"/>
           <w:sz w:val="21"/>
           <w:szCs w:val="21"/>
-          <w:bdr w:val="none" w:color="auto" w:sz="0" w:space="0"/>
         </w:rPr>
         <w:t>：攻击者可通过越权获取的教职工账号，进一步尝试访问学校教务系统的后台管理功能，引发更严重的权限泄露与业务破坏。</w:t>
       </w:r>
@@ -1546,18 +1510,18 @@
     <w:lsdException w:unhideWhenUsed="0" w:uiPriority="0" w:semiHidden="0" w:name="Document Map"/>
     <w:lsdException w:unhideWhenUsed="0" w:uiPriority="0" w:semiHidden="0" w:name="Plain Text"/>
     <w:lsdException w:unhideWhenUsed="0" w:uiPriority="0" w:semiHidden="0" w:name="E-mail Signature"/>
-    <w:lsdException w:unhideWhenUsed="0" w:uiPriority="0" w:semiHidden="0" w:name="Normal (Web)"/>
+    <w:lsdException w:qFormat="1" w:unhideWhenUsed="0" w:uiPriority="0" w:semiHidden="0" w:name="Normal (Web)"/>
     <w:lsdException w:unhideWhenUsed="0" w:uiPriority="0" w:semiHidden="0" w:name="HTML Acronym"/>
     <w:lsdException w:unhideWhenUsed="0" w:uiPriority="0" w:semiHidden="0" w:name="HTML Address"/>
     <w:lsdException w:unhideWhenUsed="0" w:uiPriority="0" w:semiHidden="0" w:name="HTML Cite"/>
-    <w:lsdException w:unhideWhenUsed="0" w:uiPriority="0" w:semiHidden="0" w:name="HTML Code"/>
+    <w:lsdException w:qFormat="1" w:unhideWhenUsed="0" w:uiPriority="0" w:semiHidden="0" w:name="HTML Code"/>
     <w:lsdException w:unhideWhenUsed="0" w:uiPriority="0" w:semiHidden="0" w:name="HTML Definition"/>
     <w:lsdException w:unhideWhenUsed="0" w:uiPriority="0" w:semiHidden="0" w:name="HTML Keyboard"/>
     <w:lsdException w:unhideWhenUsed="0" w:uiPriority="0" w:semiHidden="0" w:name="HTML Preformatted"/>
     <w:lsdException w:unhideWhenUsed="0" w:uiPriority="0" w:semiHidden="0" w:name="HTML Sample"/>
     <w:lsdException w:unhideWhenUsed="0" w:uiPriority="0" w:semiHidden="0" w:name="HTML Typewriter"/>
     <w:lsdException w:unhideWhenUsed="0" w:uiPriority="0" w:semiHidden="0" w:name="HTML Variable"/>
-    <w:lsdException w:unhideWhenUsed="0" w:uiPriority="0" w:name="Normal Table"/>
+    <w:lsdException w:qFormat="1" w:unhideWhenUsed="0" w:uiPriority="0" w:name="Normal Table"/>
     <w:lsdException w:unhideWhenUsed="0" w:uiPriority="0" w:semiHidden="0" w:name="annotation subject"/>
     <w:lsdException w:unhideWhenUsed="0" w:uiPriority="0" w:semiHidden="0" w:name="Table Simple 1"/>
     <w:lsdException w:unhideWhenUsed="0" w:uiPriority="0" w:semiHidden="0" w:name="Table Simple 2"/>
@@ -1750,6 +1714,7 @@
   <w:style w:type="table" w:default="1" w:styleId="4">
     <w:name w:val="Normal Table"/>
     <w:semiHidden/>
+    <w:qFormat/>
     <w:uiPriority w:val="0"/>
     <w:tblPr>
       <w:tblCellMar>
@@ -1763,6 +1728,7 @@
   <w:style w:type="paragraph" w:styleId="3">
     <w:name w:val="Normal (Web)"/>
     <w:basedOn w:val="1"/>
+    <w:qFormat/>
     <w:uiPriority w:val="0"/>
     <w:pPr>
       <w:spacing w:before="0" w:beforeAutospacing="1" w:after="0" w:afterAutospacing="1"/>
@@ -1787,6 +1753,7 @@
   <w:style w:type="character" w:styleId="7">
     <w:name w:val="HTML Code"/>
     <w:basedOn w:val="5"/>
+    <w:qFormat/>
     <w:uiPriority w:val="0"/>
     <w:rPr>
       <w:rFonts w:ascii="Courier New" w:hAnsi="Courier New"/>

</xml_diff>